<commit_message>
docs: RECAP + guide sync 05/08 incluent le bouton oeil sur tous les champs mot de passe
Co-Authored-By: Claude Opus 4.8 <noreply@anthropic.com>
</commit_message>
<xml_diff>
--- a/Guide-Sync-Maison-2026-08-05.docx
+++ b/Guide-Sync-Maison-2026-08-05.docx
@@ -116,6 +116,23 @@
         <w:rPr>
           <w:b/>
         </w:rPr>
+        <w:t xml:space="preserve">Bouton « œil » sur tous les champs de mot de passe : </w:t>
+      </w:r>
+      <w:r>
+        <w:t xml:space="preserve">une icône œil permet désormais d'afficher ou de masquer le mot de passe saisi. Ajoutée sur la page de connexion, dans Paramètres (compte de démonstration + les 3 champs de la section Sécurité) et sur la page de réinitialisation. Les champs sont masqués par défaut.</w:t>
+      </w:r>
+    </w:p>
+    <w:p>
+      <w:pPr>
+        <w:pStyle w:val="Bullet"/>
+      </w:pPr>
+      <w:r>
+        <w:t xml:space="preserve">•  </w:t>
+      </w:r>
+      <w:r>
+        <w:rPr>
+          <w:b/>
+        </w:rPr>
         <w:t xml:space="preserve">Prod déjà à jour : </w:t>
       </w:r>
       <w:r>
@@ -237,7 +254,7 @@
         <w:pStyle w:val="Body"/>
       </w:pPr>
       <w:r>
-        <w:t xml:space="preserve">Si vous copiez à la main, reportez ces deux fichiers en respectant l'arborescence.</w:t>
+        <w:t xml:space="preserve">Si vous copiez à la main, reportez ces fichiers en respectant l'arborescence.</w:t>
       </w:r>
     </w:p>
     <w:p>
@@ -266,6 +283,30 @@
     </w:p>
     <w:p>
       <w:pPr>
+        <w:pStyle w:val="Code"/>
+      </w:pPr>
+      <w:r>
+        <w:rPr>
+          <w:rFonts w:ascii="Consolas" w:hAnsi="Consolas"/>
+          <w:shd w:val="clear" w:fill="EEF2F7"/>
+        </w:rPr>
+        <w:t xml:space="preserve">src/components/SettingsView.tsx</w:t>
+      </w:r>
+    </w:p>
+    <w:p>
+      <w:pPr>
+        <w:pStyle w:val="Code"/>
+      </w:pPr>
+      <w:r>
+        <w:rPr>
+          <w:rFonts w:ascii="Consolas" w:hAnsi="Consolas"/>
+          <w:shd w:val="clear" w:fill="EEF2F7"/>
+        </w:rPr>
+        <w:t xml:space="preserve">src/components/ResetPasswordView.tsx</w:t>
+      </w:r>
+    </w:p>
+    <w:p>
+      <w:pPr>
         <w:pStyle w:val="Body"/>
       </w:pPr>
       <w:r>
@@ -536,7 +577,74 @@
         <w:pStyle w:val="Heading1"/>
       </w:pPr>
       <w:r>
-        <w:t xml:space="preserve">5. Vérifier que tout marche</w:t>
+        <w:t xml:space="preserve">5. Détail — bouton œil (afficher/masquer le mot de passe)</w:t>
+      </w:r>
+    </w:p>
+    <w:p>
+      <w:pPr>
+        <w:pStyle w:val="Bullet"/>
+      </w:pPr>
+      <w:r>
+        <w:t xml:space="preserve">•  </w:t>
+      </w:r>
+      <w:r>
+        <w:rPr>
+          <w:b/>
+        </w:rPr>
+        <w:t xml:space="preserve">Où : </w:t>
+      </w:r>
+      <w:r>
+        <w:t xml:space="preserve">sur tous les champs de mot de passe du site — page de connexion, Paramètres (compte de démonstration + « Mot de passe actuel / Nouveau / Confirmation » de la section Sécurité) et page de réinitialisation.</w:t>
+      </w:r>
+    </w:p>
+    <w:p>
+      <w:pPr>
+        <w:pStyle w:val="Bullet"/>
+      </w:pPr>
+      <w:r>
+        <w:t xml:space="preserve">•  </w:t>
+      </w:r>
+      <w:r>
+        <w:rPr>
+          <w:b/>
+        </w:rPr>
+        <w:t xml:space="preserve">Comment ça marche : </w:t>
+      </w:r>
+      <w:r>
+        <w:t xml:space="preserve">une petite icône œil est placée à droite du champ. Un clic affiche le mot de passe en clair (l'icône devient un œil barré) ; un nouveau clic le remasque. Chaque champ a son propre bouton indépendant.</w:t>
+      </w:r>
+    </w:p>
+    <w:p>
+      <w:pPr>
+        <w:pStyle w:val="Bullet"/>
+      </w:pPr>
+      <w:r>
+        <w:t xml:space="preserve">•  </w:t>
+      </w:r>
+      <w:r>
+        <w:rPr>
+          <w:b/>
+        </w:rPr>
+        <w:t xml:space="preserve">Masqués par défaut : </w:t>
+      </w:r>
+      <w:r>
+        <w:t xml:space="preserve">tous les champs démarrent masqués (points). Nouveauté à noter : dans Paramètres, le mot de passe du compte de démonstration était auparavant toujours affiché en clair ; il est maintenant masqué par défaut, révélable via l'œil.</w:t>
+      </w:r>
+    </w:p>
+    <w:p>
+      <w:pPr>
+        <w:pStyle w:val="Body"/>
+      </w:pPr>
+      <w:r>
+        <w:t xml:space="preserve"/>
+      </w:r>
+    </w:p>
+    <w:p>
+      <w:pPr>
+        <w:pStyle w:val="Heading1"/>
+      </w:pPr>
+      <w:r>
+        <w:t xml:space="preserve">6. Vérifier que tout marche</w:t>
       </w:r>
     </w:p>
     <w:p>
@@ -584,10 +692,27 @@
         <w:rPr>
           <w:b/>
         </w:rPr>
+        <w:t xml:space="preserve">Bouton œil : </w:t>
+      </w:r>
+      <w:r>
+        <w:t xml:space="preserve">sur chaque champ de mot de passe (connexion, Paramètres, réinitialisation), tapez du texte puis cliquez sur l'œil : le mot de passe devient lisible, puis se remasque au second clic.</w:t>
+      </w:r>
+    </w:p>
+    <w:p>
+      <w:pPr>
+        <w:pStyle w:val="Bullet"/>
+      </w:pPr>
+      <w:r>
+        <w:t xml:space="preserve">•  </w:t>
+      </w:r>
+      <w:r>
+        <w:rPr>
+          <w:b/>
+        </w:rPr>
         <w:t xml:space="preserve">Administration : </w:t>
       </w:r>
       <w:r>
-        <w:t xml:space="preserve">en admin (admin@techcorp.io / admin123), « Paramètres » → « Compte de démonstration » montre toujours le mot de passe et permet de le modifier.</w:t>
+        <w:t xml:space="preserve">en admin (admin@techcorp.io / admin123), « Paramètres » → « Compte de démonstration » montre toujours le mot de passe (via l'œil) et permet de le modifier.</w:t>
       </w:r>
     </w:p>
     <w:p>
@@ -603,7 +728,7 @@
         <w:pStyle w:val="Heading1"/>
       </w:pPr>
       <w:r>
-        <w:t xml:space="preserve">6. À noter (rappels)</w:t>
+        <w:t xml:space="preserve">7. À noter (rappels)</w:t>
       </w:r>
     </w:p>
     <w:p>

</xml_diff>